<commit_message>
docs: functional spec + CLAUDE.md for user profile epic (JFR-174)
Co-Authored-By: Claude Sonnet 5.5 <noreply@anthropic.com>
</commit_message>
<xml_diff>
--- a/.context-docs/JedForge-FunctionalSpec-v2.0.docx
+++ b/.context-docs/JedForge-FunctionalSpec-v2.0.docx
@@ -2593,7 +2593,7 @@
           <w:sz w:val="20"/>
           <w:szCs w:val="20"/>
         </w:rPr>
-        <w:t xml:space="preserve">User profile settings: name, email, and password change at /settings.</w:t>
+        <w:t xml:space="preserve">Self-service profile at /profile, reachable from the user menu in the top-right of every screen: avatar upload, editable display name (name only; email is admin-managed), read-only platform role, organizations, projects and groups with roles, and password change. /settings keeps avatar and password change.</w:t>
       </w:r>
     </w:p>
     <w:p>
@@ -5652,7 +5652,26 @@
           <w:sz w:val="20"/>
           <w:szCs w:val="20"/>
         </w:rPr>
-        <w:t xml:space="preserve">User settings at /settings — profile, password change, avatar upload.</w:t>
+        <w:t xml:space="preserve">Account menu (avatar, top-right of the header on every screen): My Profile, Settings, Sign out.</w:t>
+      </w:r>
+    </w:p>
+    <w:p>
+      <w:pPr>
+        <w:pStyle w:val="ListParagraph"/>
+        <w:numPr>
+          <w:ilvl w:val="0"/>
+          <w:numId w:val="2"/>
+        </w:numPr>
+        <w:spacing w:after="20" w:before="20"/>
+        <w:ind w:left="360" w:hanging="360"/>
+      </w:pPr>
+      <w:r>
+        <w:rPr>
+          <w:rFonts w:ascii="Arial" w:cs="Arial" w:eastAsia="Arial" w:hAnsi="Arial"/>
+          <w:sz w:val="20"/>
+          <w:szCs w:val="20"/>
+        </w:rPr>
+        <w:t xml:space="preserve">User settings at /settings — password change, avatar upload; full profile at /profile.</w:t>
       </w:r>
     </w:p>
     <w:p>
@@ -5819,6 +5838,25 @@
           <w:szCs w:val="20"/>
         </w:rPr>
         <w:t xml:space="preserve">Admins can create, edit, and delete users, projects, and organizations.</w:t>
+      </w:r>
+    </w:p>
+    <w:p>
+      <w:pPr>
+        <w:pStyle w:val="ListParagraph"/>
+        <w:numPr>
+          <w:ilvl w:val="0"/>
+          <w:numId w:val="2"/>
+        </w:numPr>
+        <w:spacing w:after="20" w:before="20"/>
+        <w:ind w:left="360" w:hanging="360"/>
+      </w:pPr>
+      <w:r>
+        <w:rPr>
+          <w:rFonts w:ascii="Arial" w:cs="Arial" w:eastAsia="Arial" w:hAnsi="Arial"/>
+          <w:sz w:val="20"/>
+          <w:szCs w:val="20"/>
+        </w:rPr>
+        <w:t xml:space="preserve">Each user in the Users list (and in an organization's member table) links to a read-only detail page at /admin/users/[userId]: identity and role, activity counts, organization/project/group memberships with roles, and API keys the user created (name, organization, last used, revoked — never key material). Edit, reset password, add to project and delete are available from that page.</w:t>
       </w:r>
     </w:p>
     <w:p>

</xml_diff>

<commit_message>
docs: functional spec + CLAUDE.md for user profile epic (JFR-174) (#115)
Co-authored-by: Claude Sonnet 5.5 <noreply@anthropic.com>
</commit_message>
<xml_diff>
--- a/.context-docs/JedForge-FunctionalSpec-v2.0.docx
+++ b/.context-docs/JedForge-FunctionalSpec-v2.0.docx
@@ -2593,7 +2593,7 @@
           <w:sz w:val="20"/>
           <w:szCs w:val="20"/>
         </w:rPr>
-        <w:t xml:space="preserve">User profile settings: name, email, and password change at /settings.</w:t>
+        <w:t xml:space="preserve">Self-service profile at /profile, reachable from the user menu in the top-right of every screen: avatar upload, editable display name (name only; email is admin-managed), read-only platform role, organizations, projects and groups with roles, and password change. /settings keeps avatar and password change.</w:t>
       </w:r>
     </w:p>
     <w:p>
@@ -5652,7 +5652,26 @@
           <w:sz w:val="20"/>
           <w:szCs w:val="20"/>
         </w:rPr>
-        <w:t xml:space="preserve">User settings at /settings — profile, password change, avatar upload.</w:t>
+        <w:t xml:space="preserve">Account menu (avatar, top-right of the header on every screen): My Profile, Settings, Sign out.</w:t>
+      </w:r>
+    </w:p>
+    <w:p>
+      <w:pPr>
+        <w:pStyle w:val="ListParagraph"/>
+        <w:numPr>
+          <w:ilvl w:val="0"/>
+          <w:numId w:val="2"/>
+        </w:numPr>
+        <w:spacing w:after="20" w:before="20"/>
+        <w:ind w:left="360" w:hanging="360"/>
+      </w:pPr>
+      <w:r>
+        <w:rPr>
+          <w:rFonts w:ascii="Arial" w:cs="Arial" w:eastAsia="Arial" w:hAnsi="Arial"/>
+          <w:sz w:val="20"/>
+          <w:szCs w:val="20"/>
+        </w:rPr>
+        <w:t xml:space="preserve">User settings at /settings — password change, avatar upload; full profile at /profile.</w:t>
       </w:r>
     </w:p>
     <w:p>
@@ -5819,6 +5838,25 @@
           <w:szCs w:val="20"/>
         </w:rPr>
         <w:t xml:space="preserve">Admins can create, edit, and delete users, projects, and organizations.</w:t>
+      </w:r>
+    </w:p>
+    <w:p>
+      <w:pPr>
+        <w:pStyle w:val="ListParagraph"/>
+        <w:numPr>
+          <w:ilvl w:val="0"/>
+          <w:numId w:val="2"/>
+        </w:numPr>
+        <w:spacing w:after="20" w:before="20"/>
+        <w:ind w:left="360" w:hanging="360"/>
+      </w:pPr>
+      <w:r>
+        <w:rPr>
+          <w:rFonts w:ascii="Arial" w:cs="Arial" w:eastAsia="Arial" w:hAnsi="Arial"/>
+          <w:sz w:val="20"/>
+          <w:szCs w:val="20"/>
+        </w:rPr>
+        <w:t xml:space="preserve">Each user in the Users list (and in an organization's member table) links to a read-only detail page at /admin/users/[userId]: identity and role, activity counts, organization/project/group memberships with roles, and API keys the user created (name, organization, last used, revoked — never key material). Edit, reset password, add to project and delete are available from that page.</w:t>
       </w:r>
     </w:p>
     <w:p>

</xml_diff>